<commit_message>
Belge onizleme ve teslim tutanagi duzenlemeleri
</commit_message>
<xml_diff>
--- a/app/static/templates/Teslim_Tutanagi_TASLAK.docx
+++ b/app/static/templates/Teslim_Tutanagi_TASLAK.docx
@@ -1,8 +1,8 @@
 
 <file path=word/document.xml><?xml version="1.0" encoding="utf-8"?>
-<w:document xmlns:wpc="http://schemas.microsoft.com/office/word/2010/wordprocessingCanvas" xmlns:cx="http://schemas.microsoft.com/office/drawing/2014/chartex" xmlns:cx1="http://schemas.microsoft.com/office/drawing/2015/9/8/chartex" xmlns:cx2="http://schemas.microsoft.com/office/drawing/2015/10/21/chartex" xmlns:cx3="http://schemas.microsoft.com/office/drawing/2016/5/9/chartex" xmlns:cx4="http://schemas.microsoft.com/office/drawing/2016/5/10/chartex" xmlns:cx5="http://schemas.microsoft.com/office/drawing/2016/5/11/chartex" xmlns:cx6="http://schemas.microsoft.com/office/drawing/2016/5/12/chartex" xmlns:cx7="http://schemas.microsoft.com/office/drawing/2016/5/13/chartex" xmlns:cx8="http://schemas.microsoft.com/office/drawing/2016/5/14/chartex" xmlns:mc="http://schemas.openxmlformats.org/markup-compatibility/2006" xmlns:aink="http://schemas.microsoft.com/office/drawing/2016/ink" xmlns:am3d="http://schemas.microsoft.com/office/drawing/2017/model3d" xmlns:o="urn:schemas-microsoft-com:office:office" xmlns:oel="http://schemas.microsoft.com/office/2019/extlst" xmlns:r="http://schemas.openxmlformats.org/officeDocument/2006/relationships" xmlns:m="http://schemas.openxmlformats.org/officeDocument/2006/math" xmlns:v="urn:schemas-microsoft-com:vml" xmlns:wp14="http://schemas.microsoft.com/office/word/2010/wordprocessingDrawing" xmlns:wp="http://schemas.openxmlformats.org/drawingml/2006/wordprocessingDrawing" xmlns:w10="urn:schemas-microsoft-com:office:word" xmlns:w="http://schemas.openxmlformats.org/wordprocessingml/2006/main" xmlns:w14="http://schemas.microsoft.com/office/word/2010/wordml" xmlns:w15="http://schemas.microsoft.com/office/word/2012/wordml" xmlns:w16cex="http://schemas.microsoft.com/office/word/2018/wordml/cex" xmlns:w16cid="http://schemas.microsoft.com/office/word/2016/wordml/cid" xmlns:w16="http://schemas.microsoft.com/office/word/2018/wordml" xmlns:w16du="http://schemas.microsoft.com/office/word/2023/wordml/word16du" xmlns:w16sdtdh="http://schemas.microsoft.com/office/word/2020/wordml/sdtdatahash" xmlns:w16sdtfl="http://schemas.microsoft.com/office/word/2024/wordml/sdtformatlock" xmlns:w16se="http://schemas.microsoft.com/office/word/2015/wordml/symex" xmlns:wpg="http://schemas.microsoft.com/office/word/2010/wordprocessingGroup" xmlns:wpi="http://schemas.microsoft.com/office/word/2010/wordprocessingInk" xmlns:wne="http://schemas.microsoft.com/office/word/2006/wordml" xmlns:wps="http://schemas.microsoft.com/office/word/2010/wordprocessingShape" mc:Ignorable="w14 w15 w16se w16cid w16 w16cex w16sdtdh w16sdtfl w16du wp14">
+<w:document xmlns:ns1="http://schemas.openxmlformats.org/markup-compatibility/2006" xmlns:ns2="http://schemas.microsoft.com/office/word/2010/wordml" xmlns:r="http://schemas.openxmlformats.org/officeDocument/2006/relationships" xmlns:w="http://schemas.openxmlformats.org/wordprocessingml/2006/main" ns1:Ignorable="w14 w15 w16se w16cid w16 w16cex w16sdtdh w16sdtfl w16du wp14">
   <w:body>
-    <w:p>
+    <w:p ns2:paraId="58EA9339" ns2:textId="64CF4442">
       <w:r>
         <w:rPr>
           <w:b/>
@@ -106,17 +106,17 @@
         <w:gridCol w:w="2538"/>
         <w:gridCol w:w="7385"/>
       </w:tblGrid>
-      <w:tr>
+      <w:tr ns2:paraId="1737C7A9" ns2:textId="77777777">
         <w:trPr>
-          <w:trHeight w:val="470"/>
           <w:tblCellSpacing w:w="15" w:type="dxa"/>
         </w:trPr>
         <w:tc>
           <w:tcPr>
-            <w:tcW w:w="2493" w:type="dxa"/>
+            <w:tcW w:w="9923" w:type="dxa"/>
             <w:vAlign w:val="center"/>
+            <w:gridSpan w:val="2"/>
           </w:tcPr>
-          <w:p>
+          <w:p ns2:paraId="4F029706" ns2:textId="5A8AC9F1">
             <w:pPr>
               <w:rPr>
                 <w:b/>
@@ -132,22 +132,8 @@
             </w:r>
           </w:p>
         </w:tc>
-        <w:tc>
-          <w:tcPr>
-            <w:tcW w:w="7340" w:type="dxa"/>
-            <w:vAlign w:val="center"/>
-          </w:tcPr>
-          <w:p>
-            <w:pPr>
-              <w:rPr>
-                <w:b/>
-                <w:bCs/>
-              </w:rPr>
-            </w:pPr>
-          </w:p>
-        </w:tc>
       </w:tr>
-      <w:tr>
+      <w:tr ns2:paraId="60DB67A0" ns2:textId="77777777">
         <w:trPr>
           <w:trHeight w:val="479"/>
           <w:tblCellSpacing w:w="15" w:type="dxa"/>
@@ -164,7 +150,7 @@
             <w:vAlign w:val="center"/>
             <w:hideMark/>
           </w:tcPr>
-          <w:p>
+          <w:p ns2:paraId="51F35FCE" ns2:textId="77777777">
             <w:r>
               <w:rPr>
                 <w:b/>
@@ -195,7 +181,7 @@
             <w:vAlign w:val="center"/>
             <w:hideMark/>
           </w:tcPr>
-          <w:p>
+          <w:p ns2:paraId="00AF51A2" ns2:textId="2A66A471">
             <w:proofErr w:type="gramStart"/>
             <w:r>
               <w:t xml:space="preserve">{{ </w:t>
@@ -215,7 +201,7 @@
           </w:p>
         </w:tc>
       </w:tr>
-      <w:tr>
+      <w:tr ns2:paraId="4C54ED44" ns2:textId="77777777">
         <w:trPr>
           <w:trHeight w:val="479"/>
           <w:tblCellSpacing w:w="15" w:type="dxa"/>
@@ -232,7 +218,7 @@
             <w:vAlign w:val="center"/>
             <w:hideMark/>
           </w:tcPr>
-          <w:p>
+          <w:p ns2:paraId="5C2352AC" ns2:textId="77777777">
             <w:r>
               <w:rPr>
                 <w:b/>
@@ -254,7 +240,7 @@
             <w:vAlign w:val="center"/>
             <w:hideMark/>
           </w:tcPr>
-          <w:p>
+          <w:p ns2:paraId="522764DA" ns2:textId="491C55C6">
             <w:proofErr w:type="gramStart"/>
             <w:r>
               <w:t xml:space="preserve">{{ </w:t>
@@ -274,7 +260,7 @@
           </w:p>
         </w:tc>
       </w:tr>
-      <w:tr>
+      <w:tr ns2:paraId="664C1799" ns2:textId="77777777">
         <w:trPr>
           <w:trHeight w:val="554"/>
           <w:tblCellSpacing w:w="15" w:type="dxa"/>
@@ -291,7 +277,7 @@
             <w:vAlign w:val="center"/>
             <w:hideMark/>
           </w:tcPr>
-          <w:p>
+          <w:p ns2:paraId="711F1D05" ns2:textId="77777777">
             <w:r>
               <w:rPr>
                 <w:b/>
@@ -313,7 +299,7 @@
             <w:vAlign w:val="center"/>
             <w:hideMark/>
           </w:tcPr>
-          <w:p>
+          <w:p ns2:paraId="51A9486B" ns2:textId="755EB765">
             <w:proofErr w:type="gramStart"/>
             <w:r>
               <w:rPr>
@@ -357,7 +343,7 @@
         </w:tc>
       </w:tr>
     </w:tbl>
-    <w:p>
+    <w:p ns2:paraId="1032238C" ns2:textId="3EA16816">
       <w:pPr>
         <w:rPr>
           <w:b/>
@@ -372,7 +358,7 @@
         <w:t>2. TESLİM EDİLEN EKİPMAN LİSTESİ</w:t>
       </w:r>
     </w:p>
-    <w:p>
+    <w:p ns2:paraId="6E8A78F7" ns2:textId="652E1D23">
       <w:r>
         <w:rPr>
           <w:i/>
@@ -383,7 +369,7 @@
     </w:p>
     <w:tbl>
       <w:tblPr>
-        <w:tblW w:w="9888" w:type="dxa"/>
+        <w:tblW w:w="9072" w:type="dxa"/>
         <w:tblBorders>
           <w:top w:val="single" w:sz="4" w:space="0" w:color="auto"/>
           <w:left w:val="single" w:sz="4" w:space="0" w:color="auto"/>
@@ -399,23 +385,28 @@
           <w:right w:w="15" w:type="dxa"/>
         </w:tblCellMar>
         <w:tblLook w:val="04A0" w:firstRow="1" w:lastRow="0" w:firstColumn="1" w:lastColumn="0" w:noHBand="0" w:noVBand="1"/>
+        <w:tblLayout w:type="fixed"/>
       </w:tblPr>
       <w:tblGrid>
-        <w:gridCol w:w="2941"/>
-        <w:gridCol w:w="1986"/>
-        <w:gridCol w:w="4961"/>
+        <w:gridCol w:w="4536"/>
+        <w:gridCol w:w="2268"/>
+        <w:gridCol w:w="2268"/>
       </w:tblGrid>
-      <w:tr>
-        <w:trPr>
-          <w:trHeight w:val="370"/>
-        </w:trPr>
+      <w:tr ns2:paraId="3C730EBC" ns2:textId="77777777">
+        <w:trPr/>
         <w:tc>
           <w:tcPr>
-            <w:tcW w:w="0" w:type="auto"/>
+            <w:tcW w:w="4536" w:type="dxa"/>
             <w:vAlign w:val="bottom"/>
             <w:hideMark/>
+            <w:tcBorders>
+              <w:top w:val="single" w:sz="4" w:space="0" w:color="000000"/>
+              <w:left w:val="single" w:sz="4" w:space="0" w:color="000000"/>
+              <w:bottom w:val="single" w:sz="4" w:space="0" w:color="000000"/>
+              <w:right w:val="single" w:sz="4" w:space="0" w:color="000000"/>
+            </w:tcBorders>
           </w:tcPr>
-          <w:p>
+          <w:p ns2:paraId="514F8408" ns2:textId="77777777">
             <w:pPr>
               <w:jc w:val="center"/>
               <w:rPr>
@@ -434,11 +425,17 @@
         </w:tc>
         <w:tc>
           <w:tcPr>
-            <w:tcW w:w="1986" w:type="dxa"/>
+            <w:tcW w:w="2268" w:type="dxa"/>
             <w:vAlign w:val="bottom"/>
             <w:hideMark/>
+            <w:tcBorders>
+              <w:top w:val="single" w:sz="4" w:space="0" w:color="000000"/>
+              <w:left w:val="single" w:sz="4" w:space="0" w:color="000000"/>
+              <w:bottom w:val="single" w:sz="4" w:space="0" w:color="000000"/>
+              <w:right w:val="single" w:sz="4" w:space="0" w:color="000000"/>
+            </w:tcBorders>
           </w:tcPr>
-          <w:p>
+          <w:p ns2:paraId="7288FAC0" ns2:textId="1E513181">
             <w:pPr>
               <w:jc w:val="center"/>
               <w:rPr>
@@ -457,11 +454,17 @@
         </w:tc>
         <w:tc>
           <w:tcPr>
-            <w:tcW w:w="4961" w:type="dxa"/>
+            <w:tcW w:w="2268" w:type="dxa"/>
             <w:vAlign w:val="bottom"/>
             <w:hideMark/>
+            <w:tcBorders>
+              <w:top w:val="single" w:sz="4" w:space="0" w:color="000000"/>
+              <w:left w:val="single" w:sz="4" w:space="0" w:color="000000"/>
+              <w:bottom w:val="single" w:sz="4" w:space="0" w:color="000000"/>
+              <w:right w:val="single" w:sz="4" w:space="0" w:color="000000"/>
+            </w:tcBorders>
           </w:tcPr>
-          <w:p>
+          <w:p ns2:paraId="0C087B68" ns2:textId="77777777">
             <w:pPr>
               <w:jc w:val="center"/>
               <w:rPr>
@@ -479,193 +482,186 @@
           </w:p>
         </w:tc>
       </w:tr>
-      <w:tr>
-        <w:trPr>
-          <w:trHeight w:val="810"/>
-        </w:trPr>
+      <w:tr ns2:paraId="59CFED47" ns2:textId="77777777">
+        <w:trPr/>
         <w:tc>
           <w:tcPr>
-            <w:tcW w:w="0" w:type="auto"/>
+            <w:tcW w:w="4536" w:type="dxa"/>
+            <w:vAlign w:val="bottom"/>
+            <w:hideMark/>
+          </w:tcPr>
+          <w:p ns2:paraId="4C559458" ns2:textId="77777777">
+            <w:pPr>
+              <w:jc w:val="center"/>
+            </w:pPr>
+            <w:r>
+              <w:t xml:space="preserve">{%tr for k in kalemler %}</w:t>
+            </w:r>
+            <w:proofErr w:type="spellStart"/>
+            <w:proofErr w:type="spellEnd"/>
+          </w:p>
+        </w:tc>
+        <w:tc>
+          <w:tcPr>
+            <w:tcW w:w="2268" w:type="dxa"/>
+            <w:vAlign w:val="bottom"/>
+            <w:hideMark/>
+          </w:tcPr>
+          <w:p ns2:paraId="6B2449E4" ns2:textId="1FEA2B8D">
+            <w:pPr>
+              <w:jc w:val="center"/>
+            </w:pPr>
+            <w:proofErr w:type="gramStart"/>
+            <w:r>
+              <w:t xml:space="preserve"/>
+            </w:r>
+            <w:proofErr w:type="spellStart"/>
+            <w:proofErr w:type="gramEnd"/>
+            <w:proofErr w:type="spellEnd"/>
+          </w:p>
+        </w:tc>
+        <w:tc>
+          <w:tcPr>
+            <w:tcW w:w="2268" w:type="dxa"/>
+            <w:vAlign w:val="bottom"/>
+            <w:hideMark/>
+          </w:tcPr>
+          <w:p ns2:paraId="6A33A1B8" ns2:textId="622EF967">
+            <w:pPr>
+              <w:jc w:val="center"/>
+            </w:pPr>
+            <w:proofErr w:type="gramStart"/>
+            <w:r>
+              <w:t xml:space="preserve"/>
+            </w:r>
+            <w:proofErr w:type="spellStart"/>
+            <w:proofErr w:type="gramEnd"/>
+            <w:proofErr w:type="spellEnd"/>
+          </w:p>
+        </w:tc>
+      </w:tr>
+      <w:tr ns2:paraId="59CFED47" ns2:textId="77777777">
+        <w:trPr/>
+        <w:tc>
+          <w:tcPr>
+            <w:tcW w:w="4536" w:type="dxa"/>
             <w:tcBorders>
-              <w:bottom w:val="single" w:sz="4" w:space="0" w:color="auto"/>
+              <w:bottom w:val="single" w:sz="4" w:space="0" w:color="000000"/>
+              <w:top w:val="single" w:sz="4" w:space="0" w:color="000000"/>
+              <w:left w:val="single" w:sz="4" w:space="0" w:color="000000"/>
+              <w:right w:val="single" w:sz="4" w:space="0" w:color="000000"/>
             </w:tcBorders>
             <w:vAlign w:val="bottom"/>
             <w:hideMark/>
           </w:tcPr>
-          <w:p>
+          <w:p ns2:paraId="4C559458" ns2:textId="77777777">
             <w:pPr>
               <w:jc w:val="center"/>
             </w:pPr>
             <w:r>
-              <w:t xml:space="preserve">{% </w:t>
+              <w:t xml:space="preserve">{{ k.ekipman }}</w:t>
             </w:r>
             <w:proofErr w:type="spellStart"/>
-            <w:r>
-              <w:t>for</w:t>
-            </w:r>
             <w:proofErr w:type="spellEnd"/>
-            <w:r>
-              <w:t xml:space="preserve"> k in kalemler %}</w:t>
-            </w:r>
           </w:p>
-          <w:p>
+        </w:tc>
+        <w:tc>
+          <w:tcPr>
+            <w:tcW w:w="2268" w:type="dxa"/>
+            <w:tcBorders>
+              <w:bottom w:val="single" w:sz="4" w:space="0" w:color="000000"/>
+              <w:top w:val="single" w:sz="4" w:space="0" w:color="000000"/>
+              <w:left w:val="single" w:sz="4" w:space="0" w:color="000000"/>
+              <w:right w:val="single" w:sz="4" w:space="0" w:color="000000"/>
+            </w:tcBorders>
+            <w:vAlign w:val="bottom"/>
+            <w:hideMark/>
+          </w:tcPr>
+          <w:p ns2:paraId="6B2449E4" ns2:textId="1FEA2B8D">
             <w:pPr>
               <w:jc w:val="center"/>
             </w:pPr>
             <w:proofErr w:type="gramStart"/>
             <w:r>
-              <w:t xml:space="preserve">{{ </w:t>
+              <w:t xml:space="preserve">{{ k.seri_no }}</w:t>
             </w:r>
             <w:proofErr w:type="spellStart"/>
-            <w:r>
-              <w:t>k</w:t>
-            </w:r>
             <w:proofErr w:type="gramEnd"/>
-            <w:r>
-              <w:t>.</w:t>
-            </w:r>
-            <w:r>
-              <w:t>ekipman</w:t>
-            </w:r>
             <w:proofErr w:type="spellEnd"/>
-            <w:r>
-              <w:t xml:space="preserve"> </w:t>
-            </w:r>
-            <w:r>
-              <w:rPr>
-                <w:sz w:val="20"/>
-                <w:szCs w:val="20"/>
-              </w:rPr>
-              <w:t>}}</w:t>
-            </w:r>
           </w:p>
         </w:tc>
         <w:tc>
           <w:tcPr>
-            <w:tcW w:w="1986" w:type="dxa"/>
+            <w:tcW w:w="2268" w:type="dxa"/>
             <w:tcBorders>
-              <w:bottom w:val="single" w:sz="4" w:space="0" w:color="auto"/>
+              <w:bottom w:val="single" w:sz="4" w:space="0" w:color="000000"/>
+              <w:top w:val="single" w:sz="4" w:space="0" w:color="000000"/>
+              <w:left w:val="single" w:sz="4" w:space="0" w:color="000000"/>
+              <w:right w:val="single" w:sz="4" w:space="0" w:color="000000"/>
             </w:tcBorders>
             <w:vAlign w:val="bottom"/>
             <w:hideMark/>
           </w:tcPr>
-          <w:p>
+          <w:p ns2:paraId="6A33A1B8" ns2:textId="622EF967">
             <w:pPr>
               <w:jc w:val="center"/>
             </w:pPr>
             <w:proofErr w:type="gramStart"/>
             <w:r>
-              <w:t xml:space="preserve">{{ </w:t>
+              <w:t xml:space="preserve">{{ k.teslim_tarihi }}</w:t>
             </w:r>
             <w:proofErr w:type="spellStart"/>
-            <w:r>
-              <w:t>k</w:t>
-            </w:r>
             <w:proofErr w:type="gramEnd"/>
-            <w:r>
-              <w:t>.seri_no</w:t>
-            </w:r>
             <w:proofErr w:type="spellEnd"/>
-            <w:r>
-              <w:t xml:space="preserve"> }}</w:t>
-            </w:r>
+          </w:p>
+        </w:tc>
+      </w:tr>
+      <w:tr ns2:paraId="52E31BEB" ns2:textId="77777777">
+        <w:trPr/>
+        <w:tc>
+          <w:tcPr>
+            <w:tcW w:w="4536" w:type="dxa"/>
+            <w:vAlign w:val="bottom"/>
+          </w:tcPr>
+          <w:p ns2:paraId="3763A457" ns2:textId="197208C1">
+            <w:r>
+              <w:t xml:space="preserve">{%tr endfor %}</w:t>
+            </w:r>
+            <w:proofErr w:type="spellStart"/>
+            <w:proofErr w:type="spellEnd"/>
           </w:p>
         </w:tc>
         <w:tc>
           <w:tcPr>
-            <w:tcW w:w="4961" w:type="dxa"/>
-            <w:tcBorders>
-              <w:bottom w:val="single" w:sz="4" w:space="0" w:color="auto"/>
-            </w:tcBorders>
+            <w:tcW w:w="2268" w:type="dxa"/>
             <w:vAlign w:val="bottom"/>
-            <w:hideMark/>
           </w:tcPr>
-          <w:p>
+          <w:p ns2:paraId="04A46DA2" ns2:textId="77777777">
             <w:pPr>
               <w:jc w:val="center"/>
             </w:pPr>
-            <w:proofErr w:type="gramStart"/>
-            <w:r>
-              <w:t xml:space="preserve">{{ </w:t>
-            </w:r>
-            <w:proofErr w:type="spellStart"/>
-            <w:r>
-              <w:t>k</w:t>
-            </w:r>
-            <w:proofErr w:type="gramEnd"/>
-            <w:r>
-              <w:t>.teslim_tarihi</w:t>
-            </w:r>
-            <w:proofErr w:type="spellEnd"/>
-            <w:r>
-              <w:t xml:space="preserve"> }}</w:t>
-            </w:r>
-          </w:p>
-        </w:tc>
-      </w:tr>
-      <w:tr>
-        <w:trPr>
-          <w:trHeight w:val="749"/>
-        </w:trPr>
-        <w:tc>
-          <w:tcPr>
-            <w:tcW w:w="0" w:type="auto"/>
-            <w:tcBorders>
-              <w:left w:val="nil"/>
-              <w:bottom w:val="nil"/>
-              <w:right w:val="nil"/>
-            </w:tcBorders>
-            <w:vAlign w:val="bottom"/>
-          </w:tcPr>
-          <w:p>
-            <w:r>
-              <w:t xml:space="preserve">{% </w:t>
-            </w:r>
-            <w:proofErr w:type="spellStart"/>
-            <w:r>
-              <w:t>endfor</w:t>
-            </w:r>
-            <w:proofErr w:type="spellEnd"/>
-            <w:r>
-              <w:t xml:space="preserve"> %}</w:t>
+            <w:r>
+              <w:t/>
             </w:r>
           </w:p>
         </w:tc>
         <w:tc>
           <w:tcPr>
-            <w:tcW w:w="1986" w:type="dxa"/>
-            <w:tcBorders>
-              <w:left w:val="nil"/>
-              <w:bottom w:val="nil"/>
-              <w:right w:val="nil"/>
-            </w:tcBorders>
+            <w:tcW w:w="2268" w:type="dxa"/>
             <w:vAlign w:val="bottom"/>
           </w:tcPr>
-          <w:p>
+          <w:p ns2:paraId="330E9E7E" ns2:textId="77777777">
             <w:pPr>
               <w:jc w:val="center"/>
             </w:pPr>
-          </w:p>
-        </w:tc>
-        <w:tc>
-          <w:tcPr>
-            <w:tcW w:w="4961" w:type="dxa"/>
-            <w:tcBorders>
-              <w:left w:val="nil"/>
-              <w:bottom w:val="nil"/>
-              <w:right w:val="nil"/>
-            </w:tcBorders>
-            <w:vAlign w:val="bottom"/>
-          </w:tcPr>
-          <w:p>
-            <w:pPr>
-              <w:jc w:val="center"/>
-            </w:pPr>
+            <w:r>
+              <w:t/>
+            </w:r>
           </w:p>
         </w:tc>
       </w:tr>
     </w:tbl>
-    <w:p>
+    <w:p ns2:paraId="18CEAA0B" ns2:textId="61129C82">
       <w:pPr>
         <w:rPr>
           <w:b/>
@@ -680,7 +676,7 @@
         <w:t>3. TESLİM ŞARTLARI VE TAAHHÜT</w:t>
       </w:r>
     </w:p>
-    <w:p>
+    <w:p ns2:paraId="4B5E1507" ns2:textId="36A2F736">
       <w:pPr>
         <w:numPr>
           <w:ilvl w:val="0"/>
@@ -698,7 +694,7 @@
         <w:t xml:space="preserve"> Kiracı, yukarıda belirtilen ekipmanları fiziksel olarak sağlam ve iş güvenliği kurallarına uygun vaziyette teslim almıştır.</w:t>
       </w:r>
     </w:p>
-    <w:p>
+    <w:p ns2:paraId="73598DC0" ns2:textId="74D3707E">
       <w:pPr>
         <w:numPr>
           <w:ilvl w:val="0"/>
@@ -719,7 +715,7 @@
         <w:t xml:space="preserve"> Ekipmanları kullanırken tüm iş güvenlik tedbirleri teslim alan sorumluluğundadır. Kullanım sırasında 3.şahıslara gelebilecek maddi manevi hasarların tazmini teslim alana aittir</w:t>
       </w:r>
     </w:p>
-    <w:p>
+    <w:p ns2:paraId="4D9FE148" ns2:textId="6E8F99B1">
       <w:pPr>
         <w:numPr>
           <w:ilvl w:val="0"/>
@@ -799,91 +795,129 @@
 </file>
 
 <file path=word/footer1.xml><?xml version="1.0" encoding="utf-8"?>
-<w:ftr xmlns:wpc="http://schemas.microsoft.com/office/word/2010/wordprocessingCanvas" xmlns:cx="http://schemas.microsoft.com/office/drawing/2014/chartex" xmlns:cx1="http://schemas.microsoft.com/office/drawing/2015/9/8/chartex" xmlns:cx2="http://schemas.microsoft.com/office/drawing/2015/10/21/chartex" xmlns:cx3="http://schemas.microsoft.com/office/drawing/2016/5/9/chartex" xmlns:cx4="http://schemas.microsoft.com/office/drawing/2016/5/10/chartex" xmlns:cx5="http://schemas.microsoft.com/office/drawing/2016/5/11/chartex" xmlns:cx6="http://schemas.microsoft.com/office/drawing/2016/5/12/chartex" xmlns:cx7="http://schemas.microsoft.com/office/drawing/2016/5/13/chartex" xmlns:cx8="http://schemas.microsoft.com/office/drawing/2016/5/14/chartex" xmlns:mc="http://schemas.openxmlformats.org/markup-compatibility/2006" xmlns:aink="http://schemas.microsoft.com/office/drawing/2016/ink" xmlns:am3d="http://schemas.microsoft.com/office/drawing/2017/model3d" xmlns:o="urn:schemas-microsoft-com:office:office" xmlns:oel="http://schemas.microsoft.com/office/2019/extlst" xmlns:r="http://schemas.openxmlformats.org/officeDocument/2006/relationships" xmlns:m="http://schemas.openxmlformats.org/officeDocument/2006/math" xmlns:v="urn:schemas-microsoft-com:vml" xmlns:wp14="http://schemas.microsoft.com/office/word/2010/wordprocessingDrawing" xmlns:wp="http://schemas.openxmlformats.org/drawingml/2006/wordprocessingDrawing" xmlns:w10="urn:schemas-microsoft-com:office:word" xmlns:w="http://schemas.openxmlformats.org/wordprocessingml/2006/main" xmlns:w14="http://schemas.microsoft.com/office/word/2010/wordml" xmlns:w15="http://schemas.microsoft.com/office/word/2012/wordml" xmlns:w16cex="http://schemas.microsoft.com/office/word/2018/wordml/cex" xmlns:w16cid="http://schemas.microsoft.com/office/word/2016/wordml/cid" xmlns:w16="http://schemas.microsoft.com/office/word/2018/wordml" xmlns:w16du="http://schemas.microsoft.com/office/word/2023/wordml/word16du" xmlns:w16sdtdh="http://schemas.microsoft.com/office/word/2020/wordml/sdtdatahash" xmlns:w16sdtfl="http://schemas.microsoft.com/office/word/2024/wordml/sdtformatlock" xmlns:w16se="http://schemas.microsoft.com/office/word/2015/wordml/symex" xmlns:wpg="http://schemas.microsoft.com/office/word/2010/wordprocessingGroup" xmlns:wpi="http://schemas.microsoft.com/office/word/2010/wordprocessingInk" xmlns:wne="http://schemas.microsoft.com/office/word/2006/wordml" xmlns:wps="http://schemas.microsoft.com/office/word/2010/wordprocessingShape" mc:Ignorable="w14 w15 w16se w16cid w16 w16cex w16sdtdh w16sdtfl w16du wp14">
-  <w:p>
-    <w:pPr>
-      <w:ind w:firstLine="708"/>
-      <w:rPr>
-        <w:b/>
-        <w:bCs/>
-      </w:rPr>
-    </w:pPr>
-    <w:r>
-      <w:rPr>
-        <w:b/>
-        <w:bCs/>
-      </w:rPr>
-      <w:t>TESLİM EDEN(PİMAKS)</w:t>
-    </w:r>
-    <w:r>
-      <w:rPr>
-        <w:b/>
-        <w:bCs/>
-      </w:rPr>
-      <w:tab/>
-    </w:r>
-    <w:r>
-      <w:rPr>
-        <w:b/>
-        <w:bCs/>
-      </w:rPr>
-      <w:tab/>
-    </w:r>
-    <w:r>
-      <w:rPr>
-        <w:b/>
-        <w:bCs/>
-      </w:rPr>
-      <w:tab/>
-    </w:r>
-    <w:r>
-      <w:rPr>
-        <w:b/>
-        <w:bCs/>
-      </w:rPr>
-      <w:tab/>
-    </w:r>
-    <w:r>
-      <w:rPr>
-        <w:b/>
-        <w:bCs/>
-      </w:rPr>
-      <w:tab/>
-      <w:t>TESLİM ALAN(KİRACI)</w:t>
-    </w:r>
-  </w:p>
-  <w:p>
-    <w:pPr>
-      <w:ind w:firstLine="708"/>
-    </w:pPr>
-    <w:r>
-      <w:t>İmza/Tarih/Kaşe</w:t>
-    </w:r>
-    <w:r>
-      <w:tab/>
-    </w:r>
-    <w:r>
-      <w:tab/>
-    </w:r>
-    <w:r>
-      <w:tab/>
-    </w:r>
-    <w:r>
-      <w:tab/>
-    </w:r>
-    <w:r>
-      <w:tab/>
-    </w:r>
-    <w:r>
-      <w:tab/>
-      <w:t>İmza/Tarih/Kaşe</w:t>
-    </w:r>
-  </w:p>
-  <w:p>
-    <w:pPr>
-      <w:pStyle w:val="AltBilgi"/>
-    </w:pPr>
-  </w:p>
+<w:ftr xmlns:ns1="http://schemas.openxmlformats.org/markup-compatibility/2006" xmlns:w="http://schemas.openxmlformats.org/wordprocessingml/2006/main" ns1:Ignorable="w14 w15 w16se w16cid w16 w16cex w16sdtdh w16sdtfl w16du wp14">
+  <w:tbl>
+    <w:tblPr>
+      <w:tblW w:w="9072" w:type="dxa"/>
+      <w:tblLayout w:type="fixed"/>
+      <w:jc w:val="center"/>
+      <w:tblBorders>
+        <w:top w:val="nil"/>
+        <w:left w:val="nil"/>
+        <w:bottom w:val="nil"/>
+        <w:right w:val="nil"/>
+        <w:insideH w:val="nil"/>
+        <w:insideV w:val="nil"/>
+      </w:tblBorders>
+    </w:tblPr>
+    <w:tblGrid>
+      <w:gridCol w:w="4536"/>
+      <w:gridCol w:w="4536"/>
+    </w:tblGrid>
+    <w:tr>
+      <w:tc>
+        <w:tcPr>
+          <w:tcW w:w="4536" w:type="dxa"/>
+          <w:vAlign w:val="top"/>
+          <w:tcMar>
+            <w:top w:w="80" w:type="dxa"/>
+            <w:left w:w="80" w:type="dxa"/>
+            <w:bottom w:w="80" w:type="dxa"/>
+            <w:right w:w="80" w:type="dxa"/>
+          </w:tcMar>
+        </w:tcPr>
+        <w:p>
+          <w:pPr>
+            <w:jc w:val="center"/>
+            <w:spacing w:before="0" w:after="0"/>
+          </w:pPr>
+          <w:r>
+            <w:rPr>
+              <w:b/>
+              <w:sz w:val="24"/>
+            </w:rPr>
+            <w:t>TESLİM EDEN</w:t>
+          </w:r>
+        </w:p>
+        <w:p>
+          <w:pPr>
+            <w:jc w:val="center"/>
+            <w:spacing w:before="0" w:after="0"/>
+          </w:pPr>
+          <w:r>
+            <w:rPr>
+              <w:b/>
+              <w:sz w:val="24"/>
+            </w:rPr>
+            <w:t>(PİMAKS)</w:t>
+          </w:r>
+        </w:p>
+        <w:p>
+          <w:pPr>
+            <w:jc w:val="center"/>
+            <w:spacing w:before="0" w:after="0"/>
+          </w:pPr>
+          <w:r>
+            <w:rPr>
+              <w:sz w:val="21"/>
+            </w:rPr>
+            <w:t>İmza / Tarih / Kaşe</w:t>
+          </w:r>
+        </w:p>
+      </w:tc>
+      <w:tc>
+        <w:tcPr>
+          <w:tcW w:w="4536" w:type="dxa"/>
+          <w:vAlign w:val="top"/>
+          <w:tcMar>
+            <w:top w:w="80" w:type="dxa"/>
+            <w:left w:w="80" w:type="dxa"/>
+            <w:bottom w:w="80" w:type="dxa"/>
+            <w:right w:w="80" w:type="dxa"/>
+          </w:tcMar>
+        </w:tcPr>
+        <w:p>
+          <w:pPr>
+            <w:jc w:val="center"/>
+            <w:spacing w:before="0" w:after="0"/>
+          </w:pPr>
+          <w:r>
+            <w:rPr>
+              <w:b/>
+              <w:sz w:val="24"/>
+            </w:rPr>
+            <w:t>TESLİM ALAN</w:t>
+          </w:r>
+        </w:p>
+        <w:p>
+          <w:pPr>
+            <w:jc w:val="center"/>
+            <w:spacing w:before="0" w:after="0"/>
+          </w:pPr>
+          <w:r>
+            <w:rPr>
+              <w:b/>
+              <w:sz w:val="24"/>
+            </w:rPr>
+            <w:t>(KİRACI)</w:t>
+          </w:r>
+        </w:p>
+        <w:p>
+          <w:pPr>
+            <w:jc w:val="center"/>
+            <w:spacing w:before="0" w:after="0"/>
+          </w:pPr>
+          <w:r>
+            <w:rPr>
+              <w:sz w:val="21"/>
+            </w:rPr>
+            <w:t>İmza / Tarih / Kaşe</w:t>
+          </w:r>
+        </w:p>
+      </w:tc>
+    </w:tr>
+  </w:tbl>
+  <w:p/>
 </w:ftr>
 </file>
 

</xml_diff>